<commit_message>
Synchronize Phase 2 document context checkpoint documentation
</commit_message>
<xml_diff>
--- a/docs/architecture/MedNexus_Enterprise_Architecture_and_Engineering_Blueprint_v1.6.docx
+++ b/docs/architecture/MedNexus_Enterprise_Architecture_and_Engineering_Blueprint_v1.6.docx
@@ -523,7 +523,7 @@
     </w:p>
     <w:p>
       <w:r>
-        <w:t>The Clinical Privacy Policy Engine remains frozen at its accepted Phase 1 POC checkpoint. Medical Document Understanding &amp; Recognition now has an accepted Phase 2 Foundation checkpoint at commit a1e8ff2. The verified repository baseline is 714 passed tests, 8 warnings, and no failures. These are engineering checkpoints, not production or clinical certification.</w:t>
+        <w:t>The Clinical Privacy Policy Engine remains frozen at its accepted Phase 1 POC checkpoint. Medical Document Understanding &amp; Recognition has reached the accepted Document Context &amp; Journey Foundation checkpoint at commit fa1a8ba68d66a3d40f40c8af3bf644f3b909191a. The verified repository baseline is 742 passed tests, 8 warnings, and no failures. These are engineering checkpoints, not production or clinical certification.</w:t>
       </w:r>
     </w:p>
     <w:p>
@@ -2874,7 +2874,7 @@
     </w:p>
     <w:p>
       <w:r>
-        <w:t>The current codebase contains an accepted Clinical Privacy Policy Engine POC and an accepted Medical Document Understanding &amp; Recognition foundation. Phase 2 reuses TXT/DOCX/text-based PDF extraction and DocumentContent, remains independent of privacy internals, and exposes standalone text/file APIs. The next milestone is Phase 2 Recognition Validation — Round 1 using a small representative healthcare-document set.</w:t>
+        <w:t>The current codebase contains an accepted Clinical Privacy Policy Engine POC and an accepted Medical Document Understanding &amp; Recognition Document Context &amp; Journey Foundation. Phase 2 reuses TXT/DOCX/text-based PDF extraction and DocumentContent, exposes standalone text/file APIs, and carries one retained document through MedNexusDocumentContext into the existing privacy pipeline without re-upload. The next milestone is Phase 2 Recognition Validation — Round 1 using a small representative healthcare-document set.</w:t>
       </w:r>
     </w:p>
     <w:p>
@@ -8521,7 +8521,7 @@
     </w:p>
     <w:p>
       <w:r>
-        <w:t>The Unified Privacy Decision Pipeline and Purpose-Based Clinical Privacy Policy Engine POC Milestone 1 are complete. The immediate product priority is the MedNexus Frontend Redesign / Policy Experience while preserving the authoritative pipeline and policy semantics.</w:t>
+        <w:t>The Unified Privacy Decision Pipeline and Purpose-Based Clinical Privacy Policy Engine POC Milestone 1 are complete. The Phase 2 Document Context &amp; Journey Foundation is accepted; the next controlled milestone is Recognition Validation — Round 1 while preserving the authoritative privacy pipeline and stage boundaries.</w:t>
       </w:r>
     </w:p>
     <w:p>
@@ -9626,7 +9626,7 @@
     </w:p>
     <w:p>
       <w:r>
-        <w:t>MedNexus now contains a validated Clinical Privacy Policy Engine and an implemented TXT/DOCX/text-based PDF ingestion path. The next immediate milestone is the Frontend Redesign / Policy Experience. The planned Custom Policy Builder is a major product differentiator, but it must configure the same unified pipeline rather than create a parallel privacy path.</w:t>
+        <w:t>MedNexus now contains a validated Clinical Privacy Policy Engine, an implemented TXT/DOCX/text-based PDF ingestion path, and an accepted Document Context &amp; Journey Foundation. The next immediate milestone is Recognition Validation — Round 1. The planned Custom Policy Builder remains a future differentiator and must configure the same unified pipeline rather than create a parallel privacy path.</w:t>
       </w:r>
     </w:p>
     <w:p>
@@ -10387,6 +10387,44 @@
     <w:p>
       <w:r>
         <w:t>Radiology Context v1 uses the Recognition Knowledge Layer and deterministic evidence to construct modality, examination, body region, contrast, semantic structure, radiologist/authentication privacy context, processing recommendations, and provenance. Unsupported or ambiguous values remain null.</w:t>
+      </w:r>
+    </w:p>
+    <w:p>
+      <w:pPr>
+        <w:pStyle w:val="Heading1"/>
+      </w:pPr>
+      <w:r>
+        <w:t>Accepted Checkpoint Synchronization — 15 August 2026</w:t>
+      </w:r>
+    </w:p>
+    <w:p>
+      <w:r>
+        <w:t>Status: ACCEPTED DOCUMENT CONTEXT &amp; JOURNEY FOUNDATION CHECKPOINT</w:t>
+      </w:r>
+    </w:p>
+    <w:p>
+      <w:r>
+        <w:t>Accepted commit: fa1a8ba68d66a3d40f40c8af3bf644f3b909191a. Previous Phase 2 checkpoints: a1e8ff2 (foundation) and 551be07 (documentation synchronization). Phase 1 remains frozen at 3486c206085652e2edac2574d277ff0970e037e2.</w:t>
+      </w:r>
+    </w:p>
+    <w:p>
+      <w:r>
+        <w:t>Canonical journey: INGEST -&gt; UNDERSTAND -&gt; PROTECT -&gt; EXTRACT -&gt; STANDARDIZE -&gt; ANALYZE -&gt; VISUALIZE -&gt; INDICATORS. MedNexusDocumentContext is the reusable semantic handoff between stages. UNDERSTAND produces document identity, structure, clinical context, privacy context, processing context, and provenance.</w:t>
+      </w:r>
+    </w:p>
+    <w:p>
+      <w:r>
+        <w:t>Current POC flow: upload once -&gt; INGEST -&gt; UNDERSTAND -&gt; MedNexusDocumentContext -&gt; Continue to Privacy Protection -&gt; existing Phase 1 privacy pipeline, without a second upload. The retained filename and document status remain visible during handoff.</w:t>
+      </w:r>
+    </w:p>
+    <w:p>
+      <w:r>
+        <w:t>Recognition Knowledge Layer v1 provides MedNexus-owned multilingual concepts, domain signatures, evidence interpretation, and external-reference provenance, with Radiology as the first reference domain. LOINC Document Ontology, DICOM/Structured Reporting, RSNA RadLex/Playbook/RadReport, SNOMED CT, HL7 CDA/C-CDA, and WHO ICD-10/ICD-11 are reference inputs only; MedNexus owns curation, normalization, signatures, context construction, and decision logic.</w:t>
+      </w:r>
+    </w:p>
+    <w:p>
+      <w:r>
+        <w:t>Progressive Result Reveal is frontend presentation of a completed authoritative output, not backend streaming. Final accepted regression baseline: 742 passed, 8 warnings, 0 failures. Documentation synchronization remains mandatory after meaningful checkpoints.</w:t>
       </w:r>
     </w:p>
     <w:sectPr>

</xml_diff>

<commit_message>
Establish MEDNEXUS7 seven transformations product architecture
</commit_message>
<xml_diff>
--- a/docs/architecture/MedNexus_Enterprise_Architecture_and_Engineering_Blueprint_v1.6.docx
+++ b/docs/architecture/MedNexus_Enterprise_Architecture_and_Engineering_Blueprint_v1.6.docx
@@ -9738,7 +9738,7 @@
         <w:spacing w:after="120"/>
       </w:pPr>
       <w:r>
-        <w:t>The enterprise target journey is: 01 Ingest → 02 Understand → 03 Protect → 04 Extract → 05 Standardize → 06 Analyze → 07 Visualize → 08 Indicators. These are target stages, not a claim that all stages are currently functional.</w:t>
+        <w:t>The public MEDNEXUS⁷ journey is: 01 Understand → 02 Protect → 03 Extract → 04 Standardize → 05 Analyze → 06 Visualize → 07 Indicators. INGEST remains an internal technical operation inside UNDERSTAND for file/text intake, extraction/parsing, and DocumentContent construction. These are target stages, not a claim that all stages are currently functional.</w:t>
       </w:r>
     </w:p>
     <w:p>
@@ -9813,7 +9813,7 @@
         <w:spacing w:after="120"/>
       </w:pPr>
       <w:r>
-        <w:t>The current frontend exposes /app as the MedNexus Enterprise Medical Document Intelligence homepage and /privacy as the functional Clinical Privacy Policy Engine POC. The Deep Teal Hybrid experience, cinematic document journey, and eight-stage narrative are an accepted working baseline, not final visual or brand polish.</w:t>
+        <w:t>The current frontend exposes /app as the MEDNEXUS⁷ Enterprise Medical Document Intelligence homepage, /understanding as the standalone Understanding POC, and /privacy as the functional Clinical Privacy Policy Engine POC. The Deep Teal Hybrid experience and seven-transformation cinematic journey are an accepted working baseline, not final visual or brand polish.</w:t>
       </w:r>
     </w:p>
     <w:p>
@@ -10409,7 +10409,7 @@
     </w:p>
     <w:p>
       <w:r>
-        <w:t>Canonical journey: INGEST -&gt; UNDERSTAND -&gt; PROTECT -&gt; EXTRACT -&gt; STANDARDIZE -&gt; ANALYZE -&gt; VISUALIZE -&gt; INDICATORS. MedNexusDocumentContext is the reusable semantic handoff between stages. UNDERSTAND produces document identity, structure, clinical context, privacy context, processing context, and provenance.</w:t>
+        <w:t>Canonical public journey: UNDERSTAND -&gt; PROTECT -&gt; EXTRACT -&gt; STANDARDIZE -&gt; ANALYZE -&gt; VISUALIZE -&gt; INDICATORS. INGEST remains an internal technical operation inside UNDERSTAND. MedNexusDocumentContext is the reusable semantic handoff between stages. UNDERSTAND produces document identity, structure, clinical context, privacy context, processing context, and provenance.</w:t>
       </w:r>
     </w:p>
     <w:p>
@@ -10425,6 +10425,39 @@
     <w:p>
       <w:r>
         <w:t>Progressive Result Reveal is frontend presentation of a completed authoritative output, not backend streaming. Final accepted regression baseline: 742 passed, 8 warnings, 0 failures. Documentation synchronization remains mandatory after meaningful checkpoints.</w:t>
+      </w:r>
+    </w:p>
+    <w:p>
+      <w:pPr>
+        <w:pStyle w:val="Heading1"/>
+      </w:pPr>
+      <w:r>
+        <w:t>Product Architecture Synchronization — MEDNEXUS⁷</w:t>
+      </w:r>
+    </w:p>
+    <w:p>
+      <w:r>
+        <w:t>Public signature: MEDNEXUS⁷ — One document. Seven intelligent transformations.</w:t>
+      </w:r>
+    </w:p>
+    <w:p>
+      <w:r>
+        <w:t>The superscript 7 is a visual/product brand signature. Internal code identifiers, Python packages, classes, APIs, routes, repository names, session identifiers, and runtime contracts remain MedNexus. MedNexus7 is a textual fallback only where superscript typography is unavailable.</w:t>
+      </w:r>
+    </w:p>
+    <w:p>
+      <w:r>
+        <w:t>Public transformation model: 01 UNDERSTAND; 02 PROTECT; 03 EXTRACT; 04 STANDARDIZE; 05 ANALYZE; 06 VISUALIZE; 07 INDICATORS.</w:t>
+      </w:r>
+    </w:p>
+    <w:p>
+      <w:r>
+        <w:t>Technical clarification: INGEST remains fully implemented as file/text intake, extraction/parsing, and DocumentContent construction within the public UNDERSTAND transformation. No ingestion module, extractor, API, route, or backend contract is renamed or merged.</w:t>
+      </w:r>
+    </w:p>
+    <w:p>
+      <w:r>
+        <w:t>At each transformation MedNexus adds a governed proprietary layer of document understanding, privacy decisions, structured clinical interpretation, terminology normalization, analysis, visualization, or indicator generation. The seven-stage journey is the MedNexus public product-architecture signature. Verification for this UI/product-architecture update: 743 passed, 8 warnings, 0 failures.</w:t>
       </w:r>
     </w:p>
     <w:sectPr>

</xml_diff>